<commit_message>
Simplify CV competency wording, add early career entry
</commit_message>
<xml_diff>
--- a/output/Jon_Morgan_CV.docx
+++ b/output/Jon_Morgan_CV.docx
@@ -135,6 +135,20 @@
           <w:color w:val="1A1A1A"/>
           <w:sz w:val="20"/>
         </w:rPr>
+        <w:t>Regulatory &amp; Rating-Framework Delivery — NCC Part J, Green Star, NABERS, BESS and JV3 compliance pathways delivered commercially at scale (Co-Perform); operates inside a framework to a pass/fail or star-rating outcome, not just a modelling exercise — the same discipline the ASRS/ISSB-driven roles now emerging in the market will need applied at asset level.</w:t>
+      </w:r>
+    </w:p>
+    <w:p>
+      <w:pPr>
+        <w:pStyle w:val="ListBullet"/>
+        <w:spacing w:after="80"/>
+      </w:pPr>
+      <w:r>
+        <w:rPr>
+          <w:rFonts w:ascii="Calibri" w:hAnsi="Calibri"/>
+          <w:color w:val="1A1A1A"/>
+          <w:sz w:val="20"/>
+        </w:rPr>
         <w:t>Commercial &amp; Operational Ownership — co-ran an independent ESD consulting practice for nearly a decade, closely involved in service-line profitability, cost management, strategy, branding and team leadership.</w:t>
       </w:r>
     </w:p>
@@ -163,7 +177,7 @@
           <w:color w:val="1A1A1A"/>
           <w:sz w:val="20"/>
         </w:rPr>
-        <w:t>Physical Systems Simulation &amp; Analytics — decades of engineering work modelling fluid dynamics, thermal physics and environmental mechanics against physical reality.</w:t>
+        <w:t>Systems Engineering &amp; Diagnostic Modelling — aerospace/defence-trained systems engineer; applies formal modelling method (abstraction, parameterisation, verification, validation) across aerospace, offshore, aviation, fire-safety and building-physics domains, not just buildings.</w:t>
       </w:r>
     </w:p>
     <w:p>
@@ -522,7 +536,7 @@
           <w:color w:val="1A1A1A"/>
           <w:sz w:val="20"/>
         </w:rPr>
-        <w:t>Climate Resilience &amp; Adaptation · Thermal Dynamics &amp; Building Physics · Fluid Dynamics &amp; Atmospheric Flow · Energy Systems &amp; Infrastructure · Critical Infrastructure &amp; Transport · Offshore &amp; Marine Engineering</w:t>
+        <w:t>Climate Resilience &amp; Adaptation · Regulatory &amp; Rating Frameworks (Green Star, NABERS, NCC Part J, BESS, JV3) · Thermal Dynamics &amp; Building Physics · Fluid Dynamics &amp; Atmospheric Flow · Energy Systems &amp; Infrastructure · Critical Infrastructure &amp; Transport · Offshore &amp; Marine Engineering</w:t>
       </w:r>
     </w:p>
     <w:p>

</xml_diff>